<commit_message>
Add company logo to training booklet and procedures
Logo from training-booklet/brand/logo-source.* on the front, inside and back
covers, every interior footer, the sign-off form and both Word files; small
sources are upscaled at build time. Company name updated to
שיכון ובינוי סולל בונה.

Co-Authored-By: Claude Opus 5.5 <noreply@anthropic.com>
Claude-Session: https://claude.ai/code/session_017QwGKYwn9UaxXw5WK9ZXBz
</commit_message>
<xml_diff>
--- a/training-procedures/נהלי-הכשרה-עובדים-חדשים.docx
+++ b/training-procedures/נהלי-הכשרה-עובדים-חדשים.docx
@@ -19,8 +19,53 @@
     </w:p>
     <w:p>
       <w:pPr>
+        <w:jc w:val="center"/>
+      </w:pPr>
+      <w:r>
+        <w:drawing>
+          <wp:inline distT="0" distB="0" distL="0" distR="0">
+            <wp:extent cx="1924050" cy="666750"/>
+            <wp:effectExtent t="0" r="0" b="0" l="0"/>
+            <wp:docPr id="1" name="" descr="" title=""/>
+            <wp:cNvGraphicFramePr>
+              <a:graphicFrameLocks xmlns:a="http://schemas.openxmlformats.org/drawingml/2006/main" noChangeAspect="1"/>
+            </wp:cNvGraphicFramePr>
+            <a:graphic xmlns:a="http://schemas.openxmlformats.org/drawingml/2006/main">
+              <a:graphicData uri="http://schemas.openxmlformats.org/drawingml/2006/picture">
+                <pic:pic xmlns:pic="http://schemas.openxmlformats.org/drawingml/2006/picture">
+                  <pic:nvPicPr>
+                    <pic:cNvPr id="0" name="" descr=""/>
+                    <pic:cNvPicPr>
+                      <a:picLocks noChangeAspect="1" noChangeArrowheads="1"/>
+                    </pic:cNvPicPr>
+                  </pic:nvPicPr>
+                  <pic:blipFill>
+                    <a:blip r:embed="rId29" cstate="none"/>
+                    <a:srcRect/>
+                    <a:stretch>
+                      <a:fillRect/>
+                    </a:stretch>
+                  </pic:blipFill>
+                  <pic:spPr bwMode="auto">
+                    <a:xfrm>
+                      <a:off x="0" y="0"/>
+                      <a:ext cx="1924050" cy="666750"/>
+                    </a:xfrm>
+                    <a:prstGeom prst="rect">
+                      <a:avLst/>
+                    </a:prstGeom>
+                  </pic:spPr>
+                </pic:pic>
+              </a:graphicData>
+            </a:graphic>
+          </wp:inline>
+        </w:drawing>
+      </w:r>
+    </w:p>
+    <w:p>
+      <w:pPr>
         <w:bidi/>
-        <w:spacing w:after="100" w:before="60" w:line="300"/>
+        <w:spacing w:after="500" w:before="0" w:line="300"/>
         <w:jc w:val="center"/>
       </w:pPr>
       <w:r>
@@ -28,9 +73,9 @@
           <w:rFonts w:ascii="Arial" w:cs="Arial" w:eastAsia="Arial" w:hAnsi="Arial"/>
           <w:b/>
           <w:bCs/>
-          <w:color w:val="666666"/>
-          <w:sz w:val="30"/>
-          <w:szCs w:val="30"/>
+          <w:color w:val="1F3A5F"/>
+          <w:sz w:val="22"/>
+          <w:szCs w:val="22"/>
           <w:rtl/>
         </w:rPr>
         <w:t xml:space="preserve">סולל בונה</w:t>
@@ -118,7 +163,7 @@
           <w:szCs w:val="22"/>
           <w:rtl/>
         </w:rPr>
-        <w:t xml:space="preserve">מהדורה 1 · 2026-10-22</w:t>
+        <w:t xml:space="preserve">מהדורה 1 · 2026-10-26</w:t>
       </w:r>
     </w:p>
     <w:p>
@@ -7171,7 +7216,7 @@
           <w:szCs w:val="22"/>
           <w:rtl/>
         </w:rPr>
-        <w:t xml:space="preserve">חל על אתרי החציבה והגריסה של החברה, על כל מוצרי האגרגט (חול מחצבה, עדש, פוליה, מסומסם, אגרגט מעורב) ועל העובדים: מנהל המחצבה, מנהל המגרסה, מפעילי מגרסה, טרקטוריסטים, לבורנטים ומנהל האיכות.</w:t>
+        <w:t xml:space="preserve">חל על אתרי החציבה והגריסה של החברה, על כל מוצרי האגרגט (חול מחצבה, שומשום, עדש, פוליה, אגוזית, אגרגט מעורב) ועל העובדים: מנהל המחצבה, מנהל המגרסה, מפעילי מגרסה, טרקטוריסטים, לבורנטים ומנהל האיכות.</w:t>
       </w:r>
     </w:p>
     <w:p>
@@ -7500,7 +7545,7 @@
                 <w:szCs w:val="20"/>
                 <w:rtl/>
               </w:rPr>
-              <w:t xml:space="preserve">אגרגט שרובו נשאר על נפה 4.75 מ"מ (עדש, פוליה, מסומסם).</w:t>
+              <w:t xml:space="preserve">אגרגט שרובו נשאר על נפה 4.75 מ"מ (עדש, פוליה, אגוזית).</w:t>
             </w:r>
           </w:p>
         </w:tc>
@@ -45369,7 +45414,7 @@
         <w:szCs w:val="17"/>
         <w:rtl/>
       </w:rPr>
-      <w:t xml:space="preserve">מהדורה 1 · 2026-10-22 · עמוד </w:t>
+      <w:t xml:space="preserve">מהדורה 1 · 2026-10-26 · עמוד </w:t>
     </w:r>
     <w:r>
       <w:rPr>
@@ -45412,7 +45457,7 @@
         <w:szCs w:val="17"/>
         <w:rtl/>
       </w:rPr>
-      <w:t xml:space="preserve">מהדורה 1 · 2026-10-22 · עמוד </w:t>
+      <w:t xml:space="preserve">מהדורה 1 · 2026-10-26 · עמוד </w:t>
     </w:r>
     <w:r>
       <w:rPr>
@@ -45455,7 +45500,7 @@
         <w:szCs w:val="17"/>
         <w:rtl/>
       </w:rPr>
-      <w:t xml:space="preserve">מהדורה 1 · 2026-10-22 · עמוד </w:t>
+      <w:t xml:space="preserve">מהדורה 1 · 2026-10-26 · עמוד </w:t>
     </w:r>
     <w:r>
       <w:rPr>
@@ -45498,7 +45543,7 @@
         <w:szCs w:val="17"/>
         <w:rtl/>
       </w:rPr>
-      <w:t xml:space="preserve">מהדורה 1 · 2026-10-22 · עמוד </w:t>
+      <w:t xml:space="preserve">מהדורה 1 · 2026-10-26 · עמוד </w:t>
     </w:r>
     <w:r>
       <w:rPr>
@@ -45541,7 +45586,7 @@
         <w:szCs w:val="17"/>
         <w:rtl/>
       </w:rPr>
-      <w:t xml:space="preserve">מהדורה 1 · 2026-10-22 · עמוד </w:t>
+      <w:t xml:space="preserve">מהדורה 1 · 2026-10-26 · עמוד </w:t>
     </w:r>
     <w:r>
       <w:rPr>
@@ -45584,7 +45629,7 @@
         <w:szCs w:val="17"/>
         <w:rtl/>
       </w:rPr>
-      <w:t xml:space="preserve">מהדורה 1 · 2026-10-22 · עמוד </w:t>
+      <w:t xml:space="preserve">מהדורה 1 · 2026-10-26 · עמוד </w:t>
     </w:r>
     <w:r>
       <w:rPr>
@@ -45627,7 +45672,7 @@
         <w:szCs w:val="17"/>
         <w:rtl/>
       </w:rPr>
-      <w:t xml:space="preserve">מהדורה 1 · 2026-10-22 · עמוד </w:t>
+      <w:t xml:space="preserve">מהדורה 1 · 2026-10-26 · עמוד </w:t>
     </w:r>
     <w:r>
       <w:rPr>
@@ -45670,7 +45715,7 @@
         <w:szCs w:val="17"/>
         <w:rtl/>
       </w:rPr>
-      <w:t xml:space="preserve">מהדורה 1 · 2026-10-22 · עמוד </w:t>
+      <w:t xml:space="preserve">מהדורה 1 · 2026-10-26 · עמוד </w:t>
     </w:r>
     <w:r>
       <w:rPr>
@@ -45713,7 +45758,7 @@
         <w:szCs w:val="17"/>
         <w:rtl/>
       </w:rPr>
-      <w:t xml:space="preserve">מהדורה 1 · 2026-10-22 · עמוד </w:t>
+      <w:t xml:space="preserve">מהדורה 1 · 2026-10-26 · עמוד </w:t>
     </w:r>
     <w:r>
       <w:rPr>
@@ -45756,7 +45801,7 @@
         <w:szCs w:val="17"/>
         <w:rtl/>
       </w:rPr>
-      <w:t xml:space="preserve">מהדורה 1 · 2026-10-22 · עמוד </w:t>
+      <w:t xml:space="preserve">מהדורה 1 · 2026-10-26 · עמוד </w:t>
     </w:r>
     <w:r>
       <w:rPr>
@@ -45799,7 +45844,7 @@
         <w:szCs w:val="17"/>
         <w:rtl/>
       </w:rPr>
-      <w:t xml:space="preserve">מהדורה 1 · 2026-10-22 · עמוד </w:t>
+      <w:t xml:space="preserve">מהדורה 1 · 2026-10-26 · עמוד </w:t>
     </w:r>
     <w:r>
       <w:rPr>
@@ -45866,254 +45911,1233 @@
 
 <file path=word/header1.xml><?xml version="1.0" encoding="utf-8"?>
 <w:hdr xmlns:wpc="http://schemas.microsoft.com/office/word/2010/wordprocessingCanvas" xmlns:mc="http://schemas.openxmlformats.org/markup-compatibility/2006" xmlns:o="urn:schemas-microsoft-com:office:office" xmlns:r="http://schemas.openxmlformats.org/officeDocument/2006/relationships" xmlns:m="http://schemas.openxmlformats.org/officeDocument/2006/math" xmlns:v="urn:schemas-microsoft-com:vml" xmlns:wp14="http://schemas.microsoft.com/office/word/2010/wordprocessingDrawing" xmlns:wp="http://schemas.openxmlformats.org/drawingml/2006/wordprocessingDrawing" xmlns:w10="urn:schemas-microsoft-com:office:word" xmlns:w="http://schemas.openxmlformats.org/wordprocessingml/2006/main" xmlns:w14="http://schemas.microsoft.com/office/word/2010/wordml" xmlns:w15="http://schemas.microsoft.com/office/word/2012/wordml" xmlns:wpg="http://schemas.microsoft.com/office/word/2010/wordprocessingGroup" xmlns:wpi="http://schemas.microsoft.com/office/word/2010/wordprocessingInk" xmlns:wne="http://schemas.microsoft.com/office/word/2006/wordml" xmlns:wps="http://schemas.microsoft.com/office/word/2010/wordprocessingShape" xmlns:cx="http://schemas.microsoft.com/office/drawing/2014/chartex" xmlns:cx1="http://schemas.microsoft.com/office/drawing/2015/9/8/chartex" xmlns:cx2="http://schemas.microsoft.com/office/drawing/2015/10/21/chartex" xmlns:cx3="http://schemas.microsoft.com/office/drawing/2016/5/9/chartex" xmlns:cx4="http://schemas.microsoft.com/office/drawing/2016/5/10/chartex" xmlns:cx5="http://schemas.microsoft.com/office/drawing/2016/5/11/chartex" xmlns:cx6="http://schemas.microsoft.com/office/drawing/2016/5/12/chartex" xmlns:cx7="http://schemas.microsoft.com/office/drawing/2016/5/13/chartex" xmlns:cx8="http://schemas.microsoft.com/office/drawing/2016/5/14/chartex" xmlns:w16cid="http://schemas.microsoft.com/office/word/2016/wordml/cid" xmlns:w16se="http://schemas.microsoft.com/office/word/2015/wordml/symex">
-  <w:p>
-    <w:pPr>
-      <w:pBdr>
-        <w:bottom w:val="single" w:color="1F3A5F" w:sz="6" w:space="4"/>
-      </w:pBdr>
-      <w:bidi/>
-    </w:pPr>
-    <w:r>
-      <w:rPr>
-        <w:rFonts w:ascii="Arial" w:cs="Arial" w:eastAsia="Arial" w:hAnsi="Arial"/>
-        <w:color w:val="666666"/>
-        <w:sz w:val="17"/>
-        <w:szCs w:val="17"/>
-        <w:rtl/>
-      </w:rPr>
-      <w:t xml:space="preserve">סולל בונה · תכנית הכשרה לעובדים חדשים · מבוא</w:t>
-    </w:r>
-  </w:p>
+  <w:tbl>
+    <w:tblPr>
+      <w:bidiVisual/>
+      <w:tblW w:type="dxa" w:w="9638"/>
+      <w:tblBorders>
+        <w:top w:val="single" w:color="auto" w:sz="4"/>
+        <w:left w:val="single" w:color="auto" w:sz="4"/>
+        <w:bottom w:val="single" w:color="auto" w:sz="4"/>
+        <w:right w:val="single" w:color="auto" w:sz="4"/>
+        <w:insideH w:val="single" w:color="auto" w:sz="4"/>
+        <w:insideV w:val="single" w:color="auto" w:sz="4"/>
+      </w:tblBorders>
+    </w:tblPr>
+    <w:tblGrid>
+      <w:gridCol w:w="7238"/>
+      <w:gridCol w:w="2400"/>
+    </w:tblGrid>
+    <w:tr>
+      <w:tc>
+        <w:tcPr>
+          <w:tcW w:type="dxa" w:w="7238"/>
+          <w:tcBorders>
+            <w:top w:val="none" w:color="FFFFFF" w:sz="0"/>
+            <w:left w:val="none" w:color="FFFFFF" w:sz="0"/>
+            <w:bottom w:val="single" w:color="1F3A5F" w:sz="6"/>
+            <w:right w:val="none" w:color="FFFFFF" w:sz="0"/>
+          </w:tcBorders>
+          <w:vAlign w:val="bottom"/>
+        </w:tcPr>
+        <w:p>
+          <w:pPr>
+            <w:bidi/>
+            <w:spacing w:after="60"/>
+          </w:pPr>
+          <w:r>
+            <w:rPr>
+              <w:rFonts w:ascii="Arial" w:cs="Arial" w:eastAsia="Arial" w:hAnsi="Arial"/>
+              <w:color w:val="666666"/>
+              <w:sz w:val="17"/>
+              <w:szCs w:val="17"/>
+              <w:rtl/>
+            </w:rPr>
+            <w:t xml:space="preserve">שיכון ובינוי סולל בונה · תכנית הכשרה לעובדים חדשים · מבוא</w:t>
+          </w:r>
+        </w:p>
+      </w:tc>
+      <w:tc>
+        <w:tcPr>
+          <w:tcW w:type="dxa" w:w="2400"/>
+          <w:tcBorders>
+            <w:top w:val="none" w:color="FFFFFF" w:sz="0"/>
+            <w:left w:val="none" w:color="FFFFFF" w:sz="0"/>
+            <w:bottom w:val="single" w:color="1F3A5F" w:sz="6"/>
+            <w:right w:val="none" w:color="FFFFFF" w:sz="0"/>
+          </w:tcBorders>
+          <w:vAlign w:val="bottom"/>
+        </w:tcPr>
+        <w:p>
+          <w:pPr>
+            <w:bidi/>
+            <w:spacing w:after="60"/>
+            <w:jc w:val="left"/>
+          </w:pPr>
+          <w:r>
+            <w:drawing>
+              <wp:inline distT="0" distB="0" distL="0" distR="0">
+                <wp:extent cx="714375" cy="247650"/>
+                <wp:effectExtent t="0" r="0" b="0" l="0"/>
+                <wp:docPr id="1" name="" descr="" title=""/>
+                <wp:cNvGraphicFramePr>
+                  <a:graphicFrameLocks xmlns:a="http://schemas.openxmlformats.org/drawingml/2006/main" noChangeAspect="1"/>
+                </wp:cNvGraphicFramePr>
+                <a:graphic xmlns:a="http://schemas.openxmlformats.org/drawingml/2006/main">
+                  <a:graphicData uri="http://schemas.openxmlformats.org/drawingml/2006/picture">
+                    <pic:pic xmlns:pic="http://schemas.openxmlformats.org/drawingml/2006/picture">
+                      <pic:nvPicPr>
+                        <pic:cNvPr id="0" name="" descr=""/>
+                        <pic:cNvPicPr>
+                          <a:picLocks noChangeAspect="1" noChangeArrowheads="1"/>
+                        </pic:cNvPicPr>
+                      </pic:nvPicPr>
+                      <pic:blipFill>
+                        <a:blip r:embed="rId0" cstate="none"/>
+                        <a:srcRect/>
+                        <a:stretch>
+                          <a:fillRect/>
+                        </a:stretch>
+                      </pic:blipFill>
+                      <pic:spPr bwMode="auto">
+                        <a:xfrm>
+                          <a:off x="0" y="0"/>
+                          <a:ext cx="714375" cy="247650"/>
+                        </a:xfrm>
+                        <a:prstGeom prst="rect">
+                          <a:avLst/>
+                        </a:prstGeom>
+                      </pic:spPr>
+                    </pic:pic>
+                  </a:graphicData>
+                </a:graphic>
+              </wp:inline>
+            </w:drawing>
+          </w:r>
+        </w:p>
+      </w:tc>
+    </w:tr>
+  </w:tbl>
 </w:hdr>
 </file>
 
 <file path=word/header10.xml><?xml version="1.0" encoding="utf-8"?>
 <w:hdr xmlns:wpc="http://schemas.microsoft.com/office/word/2010/wordprocessingCanvas" xmlns:mc="http://schemas.openxmlformats.org/markup-compatibility/2006" xmlns:o="urn:schemas-microsoft-com:office:office" xmlns:r="http://schemas.openxmlformats.org/officeDocument/2006/relationships" xmlns:m="http://schemas.openxmlformats.org/officeDocument/2006/math" xmlns:v="urn:schemas-microsoft-com:vml" xmlns:wp14="http://schemas.microsoft.com/office/word/2010/wordprocessingDrawing" xmlns:wp="http://schemas.openxmlformats.org/drawingml/2006/wordprocessingDrawing" xmlns:w10="urn:schemas-microsoft-com:office:word" xmlns:w="http://schemas.openxmlformats.org/wordprocessingml/2006/main" xmlns:w14="http://schemas.microsoft.com/office/word/2010/wordml" xmlns:w15="http://schemas.microsoft.com/office/word/2012/wordml" xmlns:wpg="http://schemas.microsoft.com/office/word/2010/wordprocessingGroup" xmlns:wpi="http://schemas.microsoft.com/office/word/2010/wordprocessingInk" xmlns:wne="http://schemas.microsoft.com/office/word/2006/wordml" xmlns:wps="http://schemas.microsoft.com/office/word/2010/wordprocessingShape" xmlns:cx="http://schemas.microsoft.com/office/drawing/2014/chartex" xmlns:cx1="http://schemas.microsoft.com/office/drawing/2015/9/8/chartex" xmlns:cx2="http://schemas.microsoft.com/office/drawing/2015/10/21/chartex" xmlns:cx3="http://schemas.microsoft.com/office/drawing/2016/5/9/chartex" xmlns:cx4="http://schemas.microsoft.com/office/drawing/2016/5/10/chartex" xmlns:cx5="http://schemas.microsoft.com/office/drawing/2016/5/11/chartex" xmlns:cx6="http://schemas.microsoft.com/office/drawing/2016/5/12/chartex" xmlns:cx7="http://schemas.microsoft.com/office/drawing/2016/5/13/chartex" xmlns:cx8="http://schemas.microsoft.com/office/drawing/2016/5/14/chartex" xmlns:w16cid="http://schemas.microsoft.com/office/word/2016/wordml/cid" xmlns:w16se="http://schemas.microsoft.com/office/word/2015/wordml/symex">
-  <w:p>
-    <w:pPr>
-      <w:pBdr>
-        <w:bottom w:val="single" w:color="1F3A5F" w:sz="6" w:space="4"/>
-      </w:pBdr>
-      <w:bidi/>
-    </w:pPr>
-    <w:r>
-      <w:rPr>
-        <w:rFonts w:ascii="Arial" w:cs="Arial" w:eastAsia="Arial" w:hAnsi="Arial"/>
-        <w:color w:val="666666"/>
-        <w:sz w:val="17"/>
-        <w:szCs w:val="17"/>
-        <w:rtl/>
-      </w:rPr>
-      <w:t xml:space="preserve">סולל בונה · תכנית הכשרה לעובדים חדשים · נוהל QA-09</w:t>
-    </w:r>
-  </w:p>
+  <w:tbl>
+    <w:tblPr>
+      <w:bidiVisual/>
+      <w:tblW w:type="dxa" w:w="9638"/>
+      <w:tblBorders>
+        <w:top w:val="single" w:color="auto" w:sz="4"/>
+        <w:left w:val="single" w:color="auto" w:sz="4"/>
+        <w:bottom w:val="single" w:color="auto" w:sz="4"/>
+        <w:right w:val="single" w:color="auto" w:sz="4"/>
+        <w:insideH w:val="single" w:color="auto" w:sz="4"/>
+        <w:insideV w:val="single" w:color="auto" w:sz="4"/>
+      </w:tblBorders>
+    </w:tblPr>
+    <w:tblGrid>
+      <w:gridCol w:w="7238"/>
+      <w:gridCol w:w="2400"/>
+    </w:tblGrid>
+    <w:tr>
+      <w:tc>
+        <w:tcPr>
+          <w:tcW w:type="dxa" w:w="7238"/>
+          <w:tcBorders>
+            <w:top w:val="none" w:color="FFFFFF" w:sz="0"/>
+            <w:left w:val="none" w:color="FFFFFF" w:sz="0"/>
+            <w:bottom w:val="single" w:color="1F3A5F" w:sz="6"/>
+            <w:right w:val="none" w:color="FFFFFF" w:sz="0"/>
+          </w:tcBorders>
+          <w:vAlign w:val="bottom"/>
+        </w:tcPr>
+        <w:p>
+          <w:pPr>
+            <w:bidi/>
+            <w:spacing w:after="60"/>
+          </w:pPr>
+          <w:r>
+            <w:rPr>
+              <w:rFonts w:ascii="Arial" w:cs="Arial" w:eastAsia="Arial" w:hAnsi="Arial"/>
+              <w:color w:val="666666"/>
+              <w:sz w:val="17"/>
+              <w:szCs w:val="17"/>
+              <w:rtl/>
+            </w:rPr>
+            <w:t xml:space="preserve">שיכון ובינוי סולל בונה · תכנית הכשרה לעובדים חדשים · נוהל QA-09</w:t>
+          </w:r>
+        </w:p>
+      </w:tc>
+      <w:tc>
+        <w:tcPr>
+          <w:tcW w:type="dxa" w:w="2400"/>
+          <w:tcBorders>
+            <w:top w:val="none" w:color="FFFFFF" w:sz="0"/>
+            <w:left w:val="none" w:color="FFFFFF" w:sz="0"/>
+            <w:bottom w:val="single" w:color="1F3A5F" w:sz="6"/>
+            <w:right w:val="none" w:color="FFFFFF" w:sz="0"/>
+          </w:tcBorders>
+          <w:vAlign w:val="bottom"/>
+        </w:tcPr>
+        <w:p>
+          <w:pPr>
+            <w:bidi/>
+            <w:spacing w:after="60"/>
+            <w:jc w:val="left"/>
+          </w:pPr>
+          <w:r>
+            <w:drawing>
+              <wp:inline distT="0" distB="0" distL="0" distR="0">
+                <wp:extent cx="714375" cy="247650"/>
+                <wp:effectExtent t="0" r="0" b="0" l="0"/>
+                <wp:docPr id="1" name="" descr="" title=""/>
+                <wp:cNvGraphicFramePr>
+                  <a:graphicFrameLocks xmlns:a="http://schemas.openxmlformats.org/drawingml/2006/main" noChangeAspect="1"/>
+                </wp:cNvGraphicFramePr>
+                <a:graphic xmlns:a="http://schemas.openxmlformats.org/drawingml/2006/main">
+                  <a:graphicData uri="http://schemas.openxmlformats.org/drawingml/2006/picture">
+                    <pic:pic xmlns:pic="http://schemas.openxmlformats.org/drawingml/2006/picture">
+                      <pic:nvPicPr>
+                        <pic:cNvPr id="0" name="" descr=""/>
+                        <pic:cNvPicPr>
+                          <a:picLocks noChangeAspect="1" noChangeArrowheads="1"/>
+                        </pic:cNvPicPr>
+                      </pic:nvPicPr>
+                      <pic:blipFill>
+                        <a:blip r:embed="rId0" cstate="none"/>
+                        <a:srcRect/>
+                        <a:stretch>
+                          <a:fillRect/>
+                        </a:stretch>
+                      </pic:blipFill>
+                      <pic:spPr bwMode="auto">
+                        <a:xfrm>
+                          <a:off x="0" y="0"/>
+                          <a:ext cx="714375" cy="247650"/>
+                        </a:xfrm>
+                        <a:prstGeom prst="rect">
+                          <a:avLst/>
+                        </a:prstGeom>
+                      </pic:spPr>
+                    </pic:pic>
+                  </a:graphicData>
+                </a:graphic>
+              </wp:inline>
+            </w:drawing>
+          </w:r>
+        </w:p>
+      </w:tc>
+    </w:tr>
+  </w:tbl>
 </w:hdr>
 </file>
 
 <file path=word/header11.xml><?xml version="1.0" encoding="utf-8"?>
 <w:hdr xmlns:wpc="http://schemas.microsoft.com/office/word/2010/wordprocessingCanvas" xmlns:mc="http://schemas.openxmlformats.org/markup-compatibility/2006" xmlns:o="urn:schemas-microsoft-com:office:office" xmlns:r="http://schemas.openxmlformats.org/officeDocument/2006/relationships" xmlns:m="http://schemas.openxmlformats.org/officeDocument/2006/math" xmlns:v="urn:schemas-microsoft-com:vml" xmlns:wp14="http://schemas.microsoft.com/office/word/2010/wordprocessingDrawing" xmlns:wp="http://schemas.openxmlformats.org/drawingml/2006/wordprocessingDrawing" xmlns:w10="urn:schemas-microsoft-com:office:word" xmlns:w="http://schemas.openxmlformats.org/wordprocessingml/2006/main" xmlns:w14="http://schemas.microsoft.com/office/word/2010/wordml" xmlns:w15="http://schemas.microsoft.com/office/word/2012/wordml" xmlns:wpg="http://schemas.microsoft.com/office/word/2010/wordprocessingGroup" xmlns:wpi="http://schemas.microsoft.com/office/word/2010/wordprocessingInk" xmlns:wne="http://schemas.microsoft.com/office/word/2006/wordml" xmlns:wps="http://schemas.microsoft.com/office/word/2010/wordprocessingShape" xmlns:cx="http://schemas.microsoft.com/office/drawing/2014/chartex" xmlns:cx1="http://schemas.microsoft.com/office/drawing/2015/9/8/chartex" xmlns:cx2="http://schemas.microsoft.com/office/drawing/2015/10/21/chartex" xmlns:cx3="http://schemas.microsoft.com/office/drawing/2016/5/9/chartex" xmlns:cx4="http://schemas.microsoft.com/office/drawing/2016/5/10/chartex" xmlns:cx5="http://schemas.microsoft.com/office/drawing/2016/5/11/chartex" xmlns:cx6="http://schemas.microsoft.com/office/drawing/2016/5/12/chartex" xmlns:cx7="http://schemas.microsoft.com/office/drawing/2016/5/13/chartex" xmlns:cx8="http://schemas.microsoft.com/office/drawing/2016/5/14/chartex" xmlns:w16cid="http://schemas.microsoft.com/office/word/2016/wordml/cid" xmlns:w16se="http://schemas.microsoft.com/office/word/2015/wordml/symex">
-  <w:p>
-    <w:pPr>
-      <w:pBdr>
-        <w:bottom w:val="single" w:color="1F3A5F" w:sz="6" w:space="4"/>
-      </w:pBdr>
-      <w:bidi/>
-    </w:pPr>
-    <w:r>
-      <w:rPr>
-        <w:rFonts w:ascii="Arial" w:cs="Arial" w:eastAsia="Arial" w:hAnsi="Arial"/>
-        <w:color w:val="666666"/>
-        <w:sz w:val="17"/>
-        <w:szCs w:val="17"/>
-        <w:rtl/>
-      </w:rPr>
-      <w:t xml:space="preserve">סולל בונה · תכנית הכשרה לעובדים חדשים · אישור הדרכה</w:t>
-    </w:r>
-  </w:p>
+  <w:tbl>
+    <w:tblPr>
+      <w:bidiVisual/>
+      <w:tblW w:type="dxa" w:w="9638"/>
+      <w:tblBorders>
+        <w:top w:val="single" w:color="auto" w:sz="4"/>
+        <w:left w:val="single" w:color="auto" w:sz="4"/>
+        <w:bottom w:val="single" w:color="auto" w:sz="4"/>
+        <w:right w:val="single" w:color="auto" w:sz="4"/>
+        <w:insideH w:val="single" w:color="auto" w:sz="4"/>
+        <w:insideV w:val="single" w:color="auto" w:sz="4"/>
+      </w:tblBorders>
+    </w:tblPr>
+    <w:tblGrid>
+      <w:gridCol w:w="7238"/>
+      <w:gridCol w:w="2400"/>
+    </w:tblGrid>
+    <w:tr>
+      <w:tc>
+        <w:tcPr>
+          <w:tcW w:type="dxa" w:w="7238"/>
+          <w:tcBorders>
+            <w:top w:val="none" w:color="FFFFFF" w:sz="0"/>
+            <w:left w:val="none" w:color="FFFFFF" w:sz="0"/>
+            <w:bottom w:val="single" w:color="1F3A5F" w:sz="6"/>
+            <w:right w:val="none" w:color="FFFFFF" w:sz="0"/>
+          </w:tcBorders>
+          <w:vAlign w:val="bottom"/>
+        </w:tcPr>
+        <w:p>
+          <w:pPr>
+            <w:bidi/>
+            <w:spacing w:after="60"/>
+          </w:pPr>
+          <w:r>
+            <w:rPr>
+              <w:rFonts w:ascii="Arial" w:cs="Arial" w:eastAsia="Arial" w:hAnsi="Arial"/>
+              <w:color w:val="666666"/>
+              <w:sz w:val="17"/>
+              <w:szCs w:val="17"/>
+              <w:rtl/>
+            </w:rPr>
+            <w:t xml:space="preserve">שיכון ובינוי סולל בונה · תכנית הכשרה לעובדים חדשים · אישור הדרכה</w:t>
+          </w:r>
+        </w:p>
+      </w:tc>
+      <w:tc>
+        <w:tcPr>
+          <w:tcW w:type="dxa" w:w="2400"/>
+          <w:tcBorders>
+            <w:top w:val="none" w:color="FFFFFF" w:sz="0"/>
+            <w:left w:val="none" w:color="FFFFFF" w:sz="0"/>
+            <w:bottom w:val="single" w:color="1F3A5F" w:sz="6"/>
+            <w:right w:val="none" w:color="FFFFFF" w:sz="0"/>
+          </w:tcBorders>
+          <w:vAlign w:val="bottom"/>
+        </w:tcPr>
+        <w:p>
+          <w:pPr>
+            <w:bidi/>
+            <w:spacing w:after="60"/>
+            <w:jc w:val="left"/>
+          </w:pPr>
+          <w:r>
+            <w:drawing>
+              <wp:inline distT="0" distB="0" distL="0" distR="0">
+                <wp:extent cx="714375" cy="247650"/>
+                <wp:effectExtent t="0" r="0" b="0" l="0"/>
+                <wp:docPr id="1" name="" descr="" title=""/>
+                <wp:cNvGraphicFramePr>
+                  <a:graphicFrameLocks xmlns:a="http://schemas.openxmlformats.org/drawingml/2006/main" noChangeAspect="1"/>
+                </wp:cNvGraphicFramePr>
+                <a:graphic xmlns:a="http://schemas.openxmlformats.org/drawingml/2006/main">
+                  <a:graphicData uri="http://schemas.openxmlformats.org/drawingml/2006/picture">
+                    <pic:pic xmlns:pic="http://schemas.openxmlformats.org/drawingml/2006/picture">
+                      <pic:nvPicPr>
+                        <pic:cNvPr id="0" name="" descr=""/>
+                        <pic:cNvPicPr>
+                          <a:picLocks noChangeAspect="1" noChangeArrowheads="1"/>
+                        </pic:cNvPicPr>
+                      </pic:nvPicPr>
+                      <pic:blipFill>
+                        <a:blip r:embed="rId0" cstate="none"/>
+                        <a:srcRect/>
+                        <a:stretch>
+                          <a:fillRect/>
+                        </a:stretch>
+                      </pic:blipFill>
+                      <pic:spPr bwMode="auto">
+                        <a:xfrm>
+                          <a:off x="0" y="0"/>
+                          <a:ext cx="714375" cy="247650"/>
+                        </a:xfrm>
+                        <a:prstGeom prst="rect">
+                          <a:avLst/>
+                        </a:prstGeom>
+                      </pic:spPr>
+                    </pic:pic>
+                  </a:graphicData>
+                </a:graphic>
+              </wp:inline>
+            </w:drawing>
+          </w:r>
+        </w:p>
+      </w:tc>
+    </w:tr>
+  </w:tbl>
 </w:hdr>
 </file>
 
 <file path=word/header2.xml><?xml version="1.0" encoding="utf-8"?>
 <w:hdr xmlns:wpc="http://schemas.microsoft.com/office/word/2010/wordprocessingCanvas" xmlns:mc="http://schemas.openxmlformats.org/markup-compatibility/2006" xmlns:o="urn:schemas-microsoft-com:office:office" xmlns:r="http://schemas.openxmlformats.org/officeDocument/2006/relationships" xmlns:m="http://schemas.openxmlformats.org/officeDocument/2006/math" xmlns:v="urn:schemas-microsoft-com:vml" xmlns:wp14="http://schemas.microsoft.com/office/word/2010/wordprocessingDrawing" xmlns:wp="http://schemas.openxmlformats.org/drawingml/2006/wordprocessingDrawing" xmlns:w10="urn:schemas-microsoft-com:office:word" xmlns:w="http://schemas.openxmlformats.org/wordprocessingml/2006/main" xmlns:w14="http://schemas.microsoft.com/office/word/2010/wordml" xmlns:w15="http://schemas.microsoft.com/office/word/2012/wordml" xmlns:wpg="http://schemas.microsoft.com/office/word/2010/wordprocessingGroup" xmlns:wpi="http://schemas.microsoft.com/office/word/2010/wordprocessingInk" xmlns:wne="http://schemas.microsoft.com/office/word/2006/wordml" xmlns:wps="http://schemas.microsoft.com/office/word/2010/wordprocessingShape" xmlns:cx="http://schemas.microsoft.com/office/drawing/2014/chartex" xmlns:cx1="http://schemas.microsoft.com/office/drawing/2015/9/8/chartex" xmlns:cx2="http://schemas.microsoft.com/office/drawing/2015/10/21/chartex" xmlns:cx3="http://schemas.microsoft.com/office/drawing/2016/5/9/chartex" xmlns:cx4="http://schemas.microsoft.com/office/drawing/2016/5/10/chartex" xmlns:cx5="http://schemas.microsoft.com/office/drawing/2016/5/11/chartex" xmlns:cx6="http://schemas.microsoft.com/office/drawing/2016/5/12/chartex" xmlns:cx7="http://schemas.microsoft.com/office/drawing/2016/5/13/chartex" xmlns:cx8="http://schemas.microsoft.com/office/drawing/2016/5/14/chartex" xmlns:w16cid="http://schemas.microsoft.com/office/word/2016/wordml/cid" xmlns:w16se="http://schemas.microsoft.com/office/word/2015/wordml/symex">
-  <w:p>
-    <w:pPr>
-      <w:pBdr>
-        <w:bottom w:val="single" w:color="1F3A5F" w:sz="6" w:space="4"/>
-      </w:pBdr>
-      <w:bidi/>
-    </w:pPr>
-    <w:r>
-      <w:rPr>
-        <w:rFonts w:ascii="Arial" w:cs="Arial" w:eastAsia="Arial" w:hAnsi="Arial"/>
-        <w:color w:val="666666"/>
-        <w:sz w:val="17"/>
-        <w:szCs w:val="17"/>
-        <w:rtl/>
-      </w:rPr>
-      <w:t xml:space="preserve">סולל בונה · תכנית הכשרה לעובדים חדשים · נוהל QA-01</w:t>
-    </w:r>
-  </w:p>
+  <w:tbl>
+    <w:tblPr>
+      <w:bidiVisual/>
+      <w:tblW w:type="dxa" w:w="9638"/>
+      <w:tblBorders>
+        <w:top w:val="single" w:color="auto" w:sz="4"/>
+        <w:left w:val="single" w:color="auto" w:sz="4"/>
+        <w:bottom w:val="single" w:color="auto" w:sz="4"/>
+        <w:right w:val="single" w:color="auto" w:sz="4"/>
+        <w:insideH w:val="single" w:color="auto" w:sz="4"/>
+        <w:insideV w:val="single" w:color="auto" w:sz="4"/>
+      </w:tblBorders>
+    </w:tblPr>
+    <w:tblGrid>
+      <w:gridCol w:w="7238"/>
+      <w:gridCol w:w="2400"/>
+    </w:tblGrid>
+    <w:tr>
+      <w:tc>
+        <w:tcPr>
+          <w:tcW w:type="dxa" w:w="7238"/>
+          <w:tcBorders>
+            <w:top w:val="none" w:color="FFFFFF" w:sz="0"/>
+            <w:left w:val="none" w:color="FFFFFF" w:sz="0"/>
+            <w:bottom w:val="single" w:color="1F3A5F" w:sz="6"/>
+            <w:right w:val="none" w:color="FFFFFF" w:sz="0"/>
+          </w:tcBorders>
+          <w:vAlign w:val="bottom"/>
+        </w:tcPr>
+        <w:p>
+          <w:pPr>
+            <w:bidi/>
+            <w:spacing w:after="60"/>
+          </w:pPr>
+          <w:r>
+            <w:rPr>
+              <w:rFonts w:ascii="Arial" w:cs="Arial" w:eastAsia="Arial" w:hAnsi="Arial"/>
+              <w:color w:val="666666"/>
+              <w:sz w:val="17"/>
+              <w:szCs w:val="17"/>
+              <w:rtl/>
+            </w:rPr>
+            <w:t xml:space="preserve">שיכון ובינוי סולל בונה · תכנית הכשרה לעובדים חדשים · נוהל QA-01</w:t>
+          </w:r>
+        </w:p>
+      </w:tc>
+      <w:tc>
+        <w:tcPr>
+          <w:tcW w:type="dxa" w:w="2400"/>
+          <w:tcBorders>
+            <w:top w:val="none" w:color="FFFFFF" w:sz="0"/>
+            <w:left w:val="none" w:color="FFFFFF" w:sz="0"/>
+            <w:bottom w:val="single" w:color="1F3A5F" w:sz="6"/>
+            <w:right w:val="none" w:color="FFFFFF" w:sz="0"/>
+          </w:tcBorders>
+          <w:vAlign w:val="bottom"/>
+        </w:tcPr>
+        <w:p>
+          <w:pPr>
+            <w:bidi/>
+            <w:spacing w:after="60"/>
+            <w:jc w:val="left"/>
+          </w:pPr>
+          <w:r>
+            <w:drawing>
+              <wp:inline distT="0" distB="0" distL="0" distR="0">
+                <wp:extent cx="714375" cy="247650"/>
+                <wp:effectExtent t="0" r="0" b="0" l="0"/>
+                <wp:docPr id="1" name="" descr="" title=""/>
+                <wp:cNvGraphicFramePr>
+                  <a:graphicFrameLocks xmlns:a="http://schemas.openxmlformats.org/drawingml/2006/main" noChangeAspect="1"/>
+                </wp:cNvGraphicFramePr>
+                <a:graphic xmlns:a="http://schemas.openxmlformats.org/drawingml/2006/main">
+                  <a:graphicData uri="http://schemas.openxmlformats.org/drawingml/2006/picture">
+                    <pic:pic xmlns:pic="http://schemas.openxmlformats.org/drawingml/2006/picture">
+                      <pic:nvPicPr>
+                        <pic:cNvPr id="0" name="" descr=""/>
+                        <pic:cNvPicPr>
+                          <a:picLocks noChangeAspect="1" noChangeArrowheads="1"/>
+                        </pic:cNvPicPr>
+                      </pic:nvPicPr>
+                      <pic:blipFill>
+                        <a:blip r:embed="rId0" cstate="none"/>
+                        <a:srcRect/>
+                        <a:stretch>
+                          <a:fillRect/>
+                        </a:stretch>
+                      </pic:blipFill>
+                      <pic:spPr bwMode="auto">
+                        <a:xfrm>
+                          <a:off x="0" y="0"/>
+                          <a:ext cx="714375" cy="247650"/>
+                        </a:xfrm>
+                        <a:prstGeom prst="rect">
+                          <a:avLst/>
+                        </a:prstGeom>
+                      </pic:spPr>
+                    </pic:pic>
+                  </a:graphicData>
+                </a:graphic>
+              </wp:inline>
+            </w:drawing>
+          </w:r>
+        </w:p>
+      </w:tc>
+    </w:tr>
+  </w:tbl>
 </w:hdr>
 </file>
 
 <file path=word/header3.xml><?xml version="1.0" encoding="utf-8"?>
 <w:hdr xmlns:wpc="http://schemas.microsoft.com/office/word/2010/wordprocessingCanvas" xmlns:mc="http://schemas.openxmlformats.org/markup-compatibility/2006" xmlns:o="urn:schemas-microsoft-com:office:office" xmlns:r="http://schemas.openxmlformats.org/officeDocument/2006/relationships" xmlns:m="http://schemas.openxmlformats.org/officeDocument/2006/math" xmlns:v="urn:schemas-microsoft-com:vml" xmlns:wp14="http://schemas.microsoft.com/office/word/2010/wordprocessingDrawing" xmlns:wp="http://schemas.openxmlformats.org/drawingml/2006/wordprocessingDrawing" xmlns:w10="urn:schemas-microsoft-com:office:word" xmlns:w="http://schemas.openxmlformats.org/wordprocessingml/2006/main" xmlns:w14="http://schemas.microsoft.com/office/word/2010/wordml" xmlns:w15="http://schemas.microsoft.com/office/word/2012/wordml" xmlns:wpg="http://schemas.microsoft.com/office/word/2010/wordprocessingGroup" xmlns:wpi="http://schemas.microsoft.com/office/word/2010/wordprocessingInk" xmlns:wne="http://schemas.microsoft.com/office/word/2006/wordml" xmlns:wps="http://schemas.microsoft.com/office/word/2010/wordprocessingShape" xmlns:cx="http://schemas.microsoft.com/office/drawing/2014/chartex" xmlns:cx1="http://schemas.microsoft.com/office/drawing/2015/9/8/chartex" xmlns:cx2="http://schemas.microsoft.com/office/drawing/2015/10/21/chartex" xmlns:cx3="http://schemas.microsoft.com/office/drawing/2016/5/9/chartex" xmlns:cx4="http://schemas.microsoft.com/office/drawing/2016/5/10/chartex" xmlns:cx5="http://schemas.microsoft.com/office/drawing/2016/5/11/chartex" xmlns:cx6="http://schemas.microsoft.com/office/drawing/2016/5/12/chartex" xmlns:cx7="http://schemas.microsoft.com/office/drawing/2016/5/13/chartex" xmlns:cx8="http://schemas.microsoft.com/office/drawing/2016/5/14/chartex" xmlns:w16cid="http://schemas.microsoft.com/office/word/2016/wordml/cid" xmlns:w16se="http://schemas.microsoft.com/office/word/2015/wordml/symex">
-  <w:p>
-    <w:pPr>
-      <w:pBdr>
-        <w:bottom w:val="single" w:color="1F3A5F" w:sz="6" w:space="4"/>
-      </w:pBdr>
-      <w:bidi/>
-    </w:pPr>
-    <w:r>
-      <w:rPr>
-        <w:rFonts w:ascii="Arial" w:cs="Arial" w:eastAsia="Arial" w:hAnsi="Arial"/>
-        <w:color w:val="666666"/>
-        <w:sz w:val="17"/>
-        <w:szCs w:val="17"/>
-        <w:rtl/>
-      </w:rPr>
-      <w:t xml:space="preserve">סולל בונה · תכנית הכשרה לעובדים חדשים · נוהל QA-02</w:t>
-    </w:r>
-  </w:p>
+  <w:tbl>
+    <w:tblPr>
+      <w:bidiVisual/>
+      <w:tblW w:type="dxa" w:w="9638"/>
+      <w:tblBorders>
+        <w:top w:val="single" w:color="auto" w:sz="4"/>
+        <w:left w:val="single" w:color="auto" w:sz="4"/>
+        <w:bottom w:val="single" w:color="auto" w:sz="4"/>
+        <w:right w:val="single" w:color="auto" w:sz="4"/>
+        <w:insideH w:val="single" w:color="auto" w:sz="4"/>
+        <w:insideV w:val="single" w:color="auto" w:sz="4"/>
+      </w:tblBorders>
+    </w:tblPr>
+    <w:tblGrid>
+      <w:gridCol w:w="7238"/>
+      <w:gridCol w:w="2400"/>
+    </w:tblGrid>
+    <w:tr>
+      <w:tc>
+        <w:tcPr>
+          <w:tcW w:type="dxa" w:w="7238"/>
+          <w:tcBorders>
+            <w:top w:val="none" w:color="FFFFFF" w:sz="0"/>
+            <w:left w:val="none" w:color="FFFFFF" w:sz="0"/>
+            <w:bottom w:val="single" w:color="1F3A5F" w:sz="6"/>
+            <w:right w:val="none" w:color="FFFFFF" w:sz="0"/>
+          </w:tcBorders>
+          <w:vAlign w:val="bottom"/>
+        </w:tcPr>
+        <w:p>
+          <w:pPr>
+            <w:bidi/>
+            <w:spacing w:after="60"/>
+          </w:pPr>
+          <w:r>
+            <w:rPr>
+              <w:rFonts w:ascii="Arial" w:cs="Arial" w:eastAsia="Arial" w:hAnsi="Arial"/>
+              <w:color w:val="666666"/>
+              <w:sz w:val="17"/>
+              <w:szCs w:val="17"/>
+              <w:rtl/>
+            </w:rPr>
+            <w:t xml:space="preserve">שיכון ובינוי סולל בונה · תכנית הכשרה לעובדים חדשים · נוהל QA-02</w:t>
+          </w:r>
+        </w:p>
+      </w:tc>
+      <w:tc>
+        <w:tcPr>
+          <w:tcW w:type="dxa" w:w="2400"/>
+          <w:tcBorders>
+            <w:top w:val="none" w:color="FFFFFF" w:sz="0"/>
+            <w:left w:val="none" w:color="FFFFFF" w:sz="0"/>
+            <w:bottom w:val="single" w:color="1F3A5F" w:sz="6"/>
+            <w:right w:val="none" w:color="FFFFFF" w:sz="0"/>
+          </w:tcBorders>
+          <w:vAlign w:val="bottom"/>
+        </w:tcPr>
+        <w:p>
+          <w:pPr>
+            <w:bidi/>
+            <w:spacing w:after="60"/>
+            <w:jc w:val="left"/>
+          </w:pPr>
+          <w:r>
+            <w:drawing>
+              <wp:inline distT="0" distB="0" distL="0" distR="0">
+                <wp:extent cx="714375" cy="247650"/>
+                <wp:effectExtent t="0" r="0" b="0" l="0"/>
+                <wp:docPr id="1" name="" descr="" title=""/>
+                <wp:cNvGraphicFramePr>
+                  <a:graphicFrameLocks xmlns:a="http://schemas.openxmlformats.org/drawingml/2006/main" noChangeAspect="1"/>
+                </wp:cNvGraphicFramePr>
+                <a:graphic xmlns:a="http://schemas.openxmlformats.org/drawingml/2006/main">
+                  <a:graphicData uri="http://schemas.openxmlformats.org/drawingml/2006/picture">
+                    <pic:pic xmlns:pic="http://schemas.openxmlformats.org/drawingml/2006/picture">
+                      <pic:nvPicPr>
+                        <pic:cNvPr id="0" name="" descr=""/>
+                        <pic:cNvPicPr>
+                          <a:picLocks noChangeAspect="1" noChangeArrowheads="1"/>
+                        </pic:cNvPicPr>
+                      </pic:nvPicPr>
+                      <pic:blipFill>
+                        <a:blip r:embed="rId0" cstate="none"/>
+                        <a:srcRect/>
+                        <a:stretch>
+                          <a:fillRect/>
+                        </a:stretch>
+                      </pic:blipFill>
+                      <pic:spPr bwMode="auto">
+                        <a:xfrm>
+                          <a:off x="0" y="0"/>
+                          <a:ext cx="714375" cy="247650"/>
+                        </a:xfrm>
+                        <a:prstGeom prst="rect">
+                          <a:avLst/>
+                        </a:prstGeom>
+                      </pic:spPr>
+                    </pic:pic>
+                  </a:graphicData>
+                </a:graphic>
+              </wp:inline>
+            </w:drawing>
+          </w:r>
+        </w:p>
+      </w:tc>
+    </w:tr>
+  </w:tbl>
 </w:hdr>
 </file>
 
 <file path=word/header4.xml><?xml version="1.0" encoding="utf-8"?>
 <w:hdr xmlns:wpc="http://schemas.microsoft.com/office/word/2010/wordprocessingCanvas" xmlns:mc="http://schemas.openxmlformats.org/markup-compatibility/2006" xmlns:o="urn:schemas-microsoft-com:office:office" xmlns:r="http://schemas.openxmlformats.org/officeDocument/2006/relationships" xmlns:m="http://schemas.openxmlformats.org/officeDocument/2006/math" xmlns:v="urn:schemas-microsoft-com:vml" xmlns:wp14="http://schemas.microsoft.com/office/word/2010/wordprocessingDrawing" xmlns:wp="http://schemas.openxmlformats.org/drawingml/2006/wordprocessingDrawing" xmlns:w10="urn:schemas-microsoft-com:office:word" xmlns:w="http://schemas.openxmlformats.org/wordprocessingml/2006/main" xmlns:w14="http://schemas.microsoft.com/office/word/2010/wordml" xmlns:w15="http://schemas.microsoft.com/office/word/2012/wordml" xmlns:wpg="http://schemas.microsoft.com/office/word/2010/wordprocessingGroup" xmlns:wpi="http://schemas.microsoft.com/office/word/2010/wordprocessingInk" xmlns:wne="http://schemas.microsoft.com/office/word/2006/wordml" xmlns:wps="http://schemas.microsoft.com/office/word/2010/wordprocessingShape" xmlns:cx="http://schemas.microsoft.com/office/drawing/2014/chartex" xmlns:cx1="http://schemas.microsoft.com/office/drawing/2015/9/8/chartex" xmlns:cx2="http://schemas.microsoft.com/office/drawing/2015/10/21/chartex" xmlns:cx3="http://schemas.microsoft.com/office/drawing/2016/5/9/chartex" xmlns:cx4="http://schemas.microsoft.com/office/drawing/2016/5/10/chartex" xmlns:cx5="http://schemas.microsoft.com/office/drawing/2016/5/11/chartex" xmlns:cx6="http://schemas.microsoft.com/office/drawing/2016/5/12/chartex" xmlns:cx7="http://schemas.microsoft.com/office/drawing/2016/5/13/chartex" xmlns:cx8="http://schemas.microsoft.com/office/drawing/2016/5/14/chartex" xmlns:w16cid="http://schemas.microsoft.com/office/word/2016/wordml/cid" xmlns:w16se="http://schemas.microsoft.com/office/word/2015/wordml/symex">
-  <w:p>
-    <w:pPr>
-      <w:pBdr>
-        <w:bottom w:val="single" w:color="1F3A5F" w:sz="6" w:space="4"/>
-      </w:pBdr>
-      <w:bidi/>
-    </w:pPr>
-    <w:r>
-      <w:rPr>
-        <w:rFonts w:ascii="Arial" w:cs="Arial" w:eastAsia="Arial" w:hAnsi="Arial"/>
-        <w:color w:val="666666"/>
-        <w:sz w:val="17"/>
-        <w:szCs w:val="17"/>
-        <w:rtl/>
-      </w:rPr>
-      <w:t xml:space="preserve">סולל בונה · תכנית הכשרה לעובדים חדשים · נוהל QA-03</w:t>
-    </w:r>
-  </w:p>
+  <w:tbl>
+    <w:tblPr>
+      <w:bidiVisual/>
+      <w:tblW w:type="dxa" w:w="9638"/>
+      <w:tblBorders>
+        <w:top w:val="single" w:color="auto" w:sz="4"/>
+        <w:left w:val="single" w:color="auto" w:sz="4"/>
+        <w:bottom w:val="single" w:color="auto" w:sz="4"/>
+        <w:right w:val="single" w:color="auto" w:sz="4"/>
+        <w:insideH w:val="single" w:color="auto" w:sz="4"/>
+        <w:insideV w:val="single" w:color="auto" w:sz="4"/>
+      </w:tblBorders>
+    </w:tblPr>
+    <w:tblGrid>
+      <w:gridCol w:w="7238"/>
+      <w:gridCol w:w="2400"/>
+    </w:tblGrid>
+    <w:tr>
+      <w:tc>
+        <w:tcPr>
+          <w:tcW w:type="dxa" w:w="7238"/>
+          <w:tcBorders>
+            <w:top w:val="none" w:color="FFFFFF" w:sz="0"/>
+            <w:left w:val="none" w:color="FFFFFF" w:sz="0"/>
+            <w:bottom w:val="single" w:color="1F3A5F" w:sz="6"/>
+            <w:right w:val="none" w:color="FFFFFF" w:sz="0"/>
+          </w:tcBorders>
+          <w:vAlign w:val="bottom"/>
+        </w:tcPr>
+        <w:p>
+          <w:pPr>
+            <w:bidi/>
+            <w:spacing w:after="60"/>
+          </w:pPr>
+          <w:r>
+            <w:rPr>
+              <w:rFonts w:ascii="Arial" w:cs="Arial" w:eastAsia="Arial" w:hAnsi="Arial"/>
+              <w:color w:val="666666"/>
+              <w:sz w:val="17"/>
+              <w:szCs w:val="17"/>
+              <w:rtl/>
+            </w:rPr>
+            <w:t xml:space="preserve">שיכון ובינוי סולל בונה · תכנית הכשרה לעובדים חדשים · נוהל QA-03</w:t>
+          </w:r>
+        </w:p>
+      </w:tc>
+      <w:tc>
+        <w:tcPr>
+          <w:tcW w:type="dxa" w:w="2400"/>
+          <w:tcBorders>
+            <w:top w:val="none" w:color="FFFFFF" w:sz="0"/>
+            <w:left w:val="none" w:color="FFFFFF" w:sz="0"/>
+            <w:bottom w:val="single" w:color="1F3A5F" w:sz="6"/>
+            <w:right w:val="none" w:color="FFFFFF" w:sz="0"/>
+          </w:tcBorders>
+          <w:vAlign w:val="bottom"/>
+        </w:tcPr>
+        <w:p>
+          <w:pPr>
+            <w:bidi/>
+            <w:spacing w:after="60"/>
+            <w:jc w:val="left"/>
+          </w:pPr>
+          <w:r>
+            <w:drawing>
+              <wp:inline distT="0" distB="0" distL="0" distR="0">
+                <wp:extent cx="714375" cy="247650"/>
+                <wp:effectExtent t="0" r="0" b="0" l="0"/>
+                <wp:docPr id="1" name="" descr="" title=""/>
+                <wp:cNvGraphicFramePr>
+                  <a:graphicFrameLocks xmlns:a="http://schemas.openxmlformats.org/drawingml/2006/main" noChangeAspect="1"/>
+                </wp:cNvGraphicFramePr>
+                <a:graphic xmlns:a="http://schemas.openxmlformats.org/drawingml/2006/main">
+                  <a:graphicData uri="http://schemas.openxmlformats.org/drawingml/2006/picture">
+                    <pic:pic xmlns:pic="http://schemas.openxmlformats.org/drawingml/2006/picture">
+                      <pic:nvPicPr>
+                        <pic:cNvPr id="0" name="" descr=""/>
+                        <pic:cNvPicPr>
+                          <a:picLocks noChangeAspect="1" noChangeArrowheads="1"/>
+                        </pic:cNvPicPr>
+                      </pic:nvPicPr>
+                      <pic:blipFill>
+                        <a:blip r:embed="rId0" cstate="none"/>
+                        <a:srcRect/>
+                        <a:stretch>
+                          <a:fillRect/>
+                        </a:stretch>
+                      </pic:blipFill>
+                      <pic:spPr bwMode="auto">
+                        <a:xfrm>
+                          <a:off x="0" y="0"/>
+                          <a:ext cx="714375" cy="247650"/>
+                        </a:xfrm>
+                        <a:prstGeom prst="rect">
+                          <a:avLst/>
+                        </a:prstGeom>
+                      </pic:spPr>
+                    </pic:pic>
+                  </a:graphicData>
+                </a:graphic>
+              </wp:inline>
+            </w:drawing>
+          </w:r>
+        </w:p>
+      </w:tc>
+    </w:tr>
+  </w:tbl>
 </w:hdr>
 </file>
 
 <file path=word/header5.xml><?xml version="1.0" encoding="utf-8"?>
 <w:hdr xmlns:wpc="http://schemas.microsoft.com/office/word/2010/wordprocessingCanvas" xmlns:mc="http://schemas.openxmlformats.org/markup-compatibility/2006" xmlns:o="urn:schemas-microsoft-com:office:office" xmlns:r="http://schemas.openxmlformats.org/officeDocument/2006/relationships" xmlns:m="http://schemas.openxmlformats.org/officeDocument/2006/math" xmlns:v="urn:schemas-microsoft-com:vml" xmlns:wp14="http://schemas.microsoft.com/office/word/2010/wordprocessingDrawing" xmlns:wp="http://schemas.openxmlformats.org/drawingml/2006/wordprocessingDrawing" xmlns:w10="urn:schemas-microsoft-com:office:word" xmlns:w="http://schemas.openxmlformats.org/wordprocessingml/2006/main" xmlns:w14="http://schemas.microsoft.com/office/word/2010/wordml" xmlns:w15="http://schemas.microsoft.com/office/word/2012/wordml" xmlns:wpg="http://schemas.microsoft.com/office/word/2010/wordprocessingGroup" xmlns:wpi="http://schemas.microsoft.com/office/word/2010/wordprocessingInk" xmlns:wne="http://schemas.microsoft.com/office/word/2006/wordml" xmlns:wps="http://schemas.microsoft.com/office/word/2010/wordprocessingShape" xmlns:cx="http://schemas.microsoft.com/office/drawing/2014/chartex" xmlns:cx1="http://schemas.microsoft.com/office/drawing/2015/9/8/chartex" xmlns:cx2="http://schemas.microsoft.com/office/drawing/2015/10/21/chartex" xmlns:cx3="http://schemas.microsoft.com/office/drawing/2016/5/9/chartex" xmlns:cx4="http://schemas.microsoft.com/office/drawing/2016/5/10/chartex" xmlns:cx5="http://schemas.microsoft.com/office/drawing/2016/5/11/chartex" xmlns:cx6="http://schemas.microsoft.com/office/drawing/2016/5/12/chartex" xmlns:cx7="http://schemas.microsoft.com/office/drawing/2016/5/13/chartex" xmlns:cx8="http://schemas.microsoft.com/office/drawing/2016/5/14/chartex" xmlns:w16cid="http://schemas.microsoft.com/office/word/2016/wordml/cid" xmlns:w16se="http://schemas.microsoft.com/office/word/2015/wordml/symex">
-  <w:p>
-    <w:pPr>
-      <w:pBdr>
-        <w:bottom w:val="single" w:color="1F3A5F" w:sz="6" w:space="4"/>
-      </w:pBdr>
-      <w:bidi/>
-    </w:pPr>
-    <w:r>
-      <w:rPr>
-        <w:rFonts w:ascii="Arial" w:cs="Arial" w:eastAsia="Arial" w:hAnsi="Arial"/>
-        <w:color w:val="666666"/>
-        <w:sz w:val="17"/>
-        <w:szCs w:val="17"/>
-        <w:rtl/>
-      </w:rPr>
-      <w:t xml:space="preserve">סולל בונה · תכנית הכשרה לעובדים חדשים · נוהל QA-04</w:t>
-    </w:r>
-  </w:p>
+  <w:tbl>
+    <w:tblPr>
+      <w:bidiVisual/>
+      <w:tblW w:type="dxa" w:w="9638"/>
+      <w:tblBorders>
+        <w:top w:val="single" w:color="auto" w:sz="4"/>
+        <w:left w:val="single" w:color="auto" w:sz="4"/>
+        <w:bottom w:val="single" w:color="auto" w:sz="4"/>
+        <w:right w:val="single" w:color="auto" w:sz="4"/>
+        <w:insideH w:val="single" w:color="auto" w:sz="4"/>
+        <w:insideV w:val="single" w:color="auto" w:sz="4"/>
+      </w:tblBorders>
+    </w:tblPr>
+    <w:tblGrid>
+      <w:gridCol w:w="7238"/>
+      <w:gridCol w:w="2400"/>
+    </w:tblGrid>
+    <w:tr>
+      <w:tc>
+        <w:tcPr>
+          <w:tcW w:type="dxa" w:w="7238"/>
+          <w:tcBorders>
+            <w:top w:val="none" w:color="FFFFFF" w:sz="0"/>
+            <w:left w:val="none" w:color="FFFFFF" w:sz="0"/>
+            <w:bottom w:val="single" w:color="1F3A5F" w:sz="6"/>
+            <w:right w:val="none" w:color="FFFFFF" w:sz="0"/>
+          </w:tcBorders>
+          <w:vAlign w:val="bottom"/>
+        </w:tcPr>
+        <w:p>
+          <w:pPr>
+            <w:bidi/>
+            <w:spacing w:after="60"/>
+          </w:pPr>
+          <w:r>
+            <w:rPr>
+              <w:rFonts w:ascii="Arial" w:cs="Arial" w:eastAsia="Arial" w:hAnsi="Arial"/>
+              <w:color w:val="666666"/>
+              <w:sz w:val="17"/>
+              <w:szCs w:val="17"/>
+              <w:rtl/>
+            </w:rPr>
+            <w:t xml:space="preserve">שיכון ובינוי סולל בונה · תכנית הכשרה לעובדים חדשים · נוהל QA-04</w:t>
+          </w:r>
+        </w:p>
+      </w:tc>
+      <w:tc>
+        <w:tcPr>
+          <w:tcW w:type="dxa" w:w="2400"/>
+          <w:tcBorders>
+            <w:top w:val="none" w:color="FFFFFF" w:sz="0"/>
+            <w:left w:val="none" w:color="FFFFFF" w:sz="0"/>
+            <w:bottom w:val="single" w:color="1F3A5F" w:sz="6"/>
+            <w:right w:val="none" w:color="FFFFFF" w:sz="0"/>
+          </w:tcBorders>
+          <w:vAlign w:val="bottom"/>
+        </w:tcPr>
+        <w:p>
+          <w:pPr>
+            <w:bidi/>
+            <w:spacing w:after="60"/>
+            <w:jc w:val="left"/>
+          </w:pPr>
+          <w:r>
+            <w:drawing>
+              <wp:inline distT="0" distB="0" distL="0" distR="0">
+                <wp:extent cx="714375" cy="247650"/>
+                <wp:effectExtent t="0" r="0" b="0" l="0"/>
+                <wp:docPr id="1" name="" descr="" title=""/>
+                <wp:cNvGraphicFramePr>
+                  <a:graphicFrameLocks xmlns:a="http://schemas.openxmlformats.org/drawingml/2006/main" noChangeAspect="1"/>
+                </wp:cNvGraphicFramePr>
+                <a:graphic xmlns:a="http://schemas.openxmlformats.org/drawingml/2006/main">
+                  <a:graphicData uri="http://schemas.openxmlformats.org/drawingml/2006/picture">
+                    <pic:pic xmlns:pic="http://schemas.openxmlformats.org/drawingml/2006/picture">
+                      <pic:nvPicPr>
+                        <pic:cNvPr id="0" name="" descr=""/>
+                        <pic:cNvPicPr>
+                          <a:picLocks noChangeAspect="1" noChangeArrowheads="1"/>
+                        </pic:cNvPicPr>
+                      </pic:nvPicPr>
+                      <pic:blipFill>
+                        <a:blip r:embed="rId0" cstate="none"/>
+                        <a:srcRect/>
+                        <a:stretch>
+                          <a:fillRect/>
+                        </a:stretch>
+                      </pic:blipFill>
+                      <pic:spPr bwMode="auto">
+                        <a:xfrm>
+                          <a:off x="0" y="0"/>
+                          <a:ext cx="714375" cy="247650"/>
+                        </a:xfrm>
+                        <a:prstGeom prst="rect">
+                          <a:avLst/>
+                        </a:prstGeom>
+                      </pic:spPr>
+                    </pic:pic>
+                  </a:graphicData>
+                </a:graphic>
+              </wp:inline>
+            </w:drawing>
+          </w:r>
+        </w:p>
+      </w:tc>
+    </w:tr>
+  </w:tbl>
 </w:hdr>
 </file>
 
 <file path=word/header6.xml><?xml version="1.0" encoding="utf-8"?>
 <w:hdr xmlns:wpc="http://schemas.microsoft.com/office/word/2010/wordprocessingCanvas" xmlns:mc="http://schemas.openxmlformats.org/markup-compatibility/2006" xmlns:o="urn:schemas-microsoft-com:office:office" xmlns:r="http://schemas.openxmlformats.org/officeDocument/2006/relationships" xmlns:m="http://schemas.openxmlformats.org/officeDocument/2006/math" xmlns:v="urn:schemas-microsoft-com:vml" xmlns:wp14="http://schemas.microsoft.com/office/word/2010/wordprocessingDrawing" xmlns:wp="http://schemas.openxmlformats.org/drawingml/2006/wordprocessingDrawing" xmlns:w10="urn:schemas-microsoft-com:office:word" xmlns:w="http://schemas.openxmlformats.org/wordprocessingml/2006/main" xmlns:w14="http://schemas.microsoft.com/office/word/2010/wordml" xmlns:w15="http://schemas.microsoft.com/office/word/2012/wordml" xmlns:wpg="http://schemas.microsoft.com/office/word/2010/wordprocessingGroup" xmlns:wpi="http://schemas.microsoft.com/office/word/2010/wordprocessingInk" xmlns:wne="http://schemas.microsoft.com/office/word/2006/wordml" xmlns:wps="http://schemas.microsoft.com/office/word/2010/wordprocessingShape" xmlns:cx="http://schemas.microsoft.com/office/drawing/2014/chartex" xmlns:cx1="http://schemas.microsoft.com/office/drawing/2015/9/8/chartex" xmlns:cx2="http://schemas.microsoft.com/office/drawing/2015/10/21/chartex" xmlns:cx3="http://schemas.microsoft.com/office/drawing/2016/5/9/chartex" xmlns:cx4="http://schemas.microsoft.com/office/drawing/2016/5/10/chartex" xmlns:cx5="http://schemas.microsoft.com/office/drawing/2016/5/11/chartex" xmlns:cx6="http://schemas.microsoft.com/office/drawing/2016/5/12/chartex" xmlns:cx7="http://schemas.microsoft.com/office/drawing/2016/5/13/chartex" xmlns:cx8="http://schemas.microsoft.com/office/drawing/2016/5/14/chartex" xmlns:w16cid="http://schemas.microsoft.com/office/word/2016/wordml/cid" xmlns:w16se="http://schemas.microsoft.com/office/word/2015/wordml/symex">
-  <w:p>
-    <w:pPr>
-      <w:pBdr>
-        <w:bottom w:val="single" w:color="1F3A5F" w:sz="6" w:space="4"/>
-      </w:pBdr>
-      <w:bidi/>
-    </w:pPr>
-    <w:r>
-      <w:rPr>
-        <w:rFonts w:ascii="Arial" w:cs="Arial" w:eastAsia="Arial" w:hAnsi="Arial"/>
-        <w:color w:val="666666"/>
-        <w:sz w:val="17"/>
-        <w:szCs w:val="17"/>
-        <w:rtl/>
-      </w:rPr>
-      <w:t xml:space="preserve">סולל בונה · תכנית הכשרה לעובדים חדשים · נוהל QA-05</w:t>
-    </w:r>
-  </w:p>
+  <w:tbl>
+    <w:tblPr>
+      <w:bidiVisual/>
+      <w:tblW w:type="dxa" w:w="9638"/>
+      <w:tblBorders>
+        <w:top w:val="single" w:color="auto" w:sz="4"/>
+        <w:left w:val="single" w:color="auto" w:sz="4"/>
+        <w:bottom w:val="single" w:color="auto" w:sz="4"/>
+        <w:right w:val="single" w:color="auto" w:sz="4"/>
+        <w:insideH w:val="single" w:color="auto" w:sz="4"/>
+        <w:insideV w:val="single" w:color="auto" w:sz="4"/>
+      </w:tblBorders>
+    </w:tblPr>
+    <w:tblGrid>
+      <w:gridCol w:w="7238"/>
+      <w:gridCol w:w="2400"/>
+    </w:tblGrid>
+    <w:tr>
+      <w:tc>
+        <w:tcPr>
+          <w:tcW w:type="dxa" w:w="7238"/>
+          <w:tcBorders>
+            <w:top w:val="none" w:color="FFFFFF" w:sz="0"/>
+            <w:left w:val="none" w:color="FFFFFF" w:sz="0"/>
+            <w:bottom w:val="single" w:color="1F3A5F" w:sz="6"/>
+            <w:right w:val="none" w:color="FFFFFF" w:sz="0"/>
+          </w:tcBorders>
+          <w:vAlign w:val="bottom"/>
+        </w:tcPr>
+        <w:p>
+          <w:pPr>
+            <w:bidi/>
+            <w:spacing w:after="60"/>
+          </w:pPr>
+          <w:r>
+            <w:rPr>
+              <w:rFonts w:ascii="Arial" w:cs="Arial" w:eastAsia="Arial" w:hAnsi="Arial"/>
+              <w:color w:val="666666"/>
+              <w:sz w:val="17"/>
+              <w:szCs w:val="17"/>
+              <w:rtl/>
+            </w:rPr>
+            <w:t xml:space="preserve">שיכון ובינוי סולל בונה · תכנית הכשרה לעובדים חדשים · נוהל QA-05</w:t>
+          </w:r>
+        </w:p>
+      </w:tc>
+      <w:tc>
+        <w:tcPr>
+          <w:tcW w:type="dxa" w:w="2400"/>
+          <w:tcBorders>
+            <w:top w:val="none" w:color="FFFFFF" w:sz="0"/>
+            <w:left w:val="none" w:color="FFFFFF" w:sz="0"/>
+            <w:bottom w:val="single" w:color="1F3A5F" w:sz="6"/>
+            <w:right w:val="none" w:color="FFFFFF" w:sz="0"/>
+          </w:tcBorders>
+          <w:vAlign w:val="bottom"/>
+        </w:tcPr>
+        <w:p>
+          <w:pPr>
+            <w:bidi/>
+            <w:spacing w:after="60"/>
+            <w:jc w:val="left"/>
+          </w:pPr>
+          <w:r>
+            <w:drawing>
+              <wp:inline distT="0" distB="0" distL="0" distR="0">
+                <wp:extent cx="714375" cy="247650"/>
+                <wp:effectExtent t="0" r="0" b="0" l="0"/>
+                <wp:docPr id="1" name="" descr="" title=""/>
+                <wp:cNvGraphicFramePr>
+                  <a:graphicFrameLocks xmlns:a="http://schemas.openxmlformats.org/drawingml/2006/main" noChangeAspect="1"/>
+                </wp:cNvGraphicFramePr>
+                <a:graphic xmlns:a="http://schemas.openxmlformats.org/drawingml/2006/main">
+                  <a:graphicData uri="http://schemas.openxmlformats.org/drawingml/2006/picture">
+                    <pic:pic xmlns:pic="http://schemas.openxmlformats.org/drawingml/2006/picture">
+                      <pic:nvPicPr>
+                        <pic:cNvPr id="0" name="" descr=""/>
+                        <pic:cNvPicPr>
+                          <a:picLocks noChangeAspect="1" noChangeArrowheads="1"/>
+                        </pic:cNvPicPr>
+                      </pic:nvPicPr>
+                      <pic:blipFill>
+                        <a:blip r:embed="rId0" cstate="none"/>
+                        <a:srcRect/>
+                        <a:stretch>
+                          <a:fillRect/>
+                        </a:stretch>
+                      </pic:blipFill>
+                      <pic:spPr bwMode="auto">
+                        <a:xfrm>
+                          <a:off x="0" y="0"/>
+                          <a:ext cx="714375" cy="247650"/>
+                        </a:xfrm>
+                        <a:prstGeom prst="rect">
+                          <a:avLst/>
+                        </a:prstGeom>
+                      </pic:spPr>
+                    </pic:pic>
+                  </a:graphicData>
+                </a:graphic>
+              </wp:inline>
+            </w:drawing>
+          </w:r>
+        </w:p>
+      </w:tc>
+    </w:tr>
+  </w:tbl>
 </w:hdr>
 </file>
 
 <file path=word/header7.xml><?xml version="1.0" encoding="utf-8"?>
 <w:hdr xmlns:wpc="http://schemas.microsoft.com/office/word/2010/wordprocessingCanvas" xmlns:mc="http://schemas.openxmlformats.org/markup-compatibility/2006" xmlns:o="urn:schemas-microsoft-com:office:office" xmlns:r="http://schemas.openxmlformats.org/officeDocument/2006/relationships" xmlns:m="http://schemas.openxmlformats.org/officeDocument/2006/math" xmlns:v="urn:schemas-microsoft-com:vml" xmlns:wp14="http://schemas.microsoft.com/office/word/2010/wordprocessingDrawing" xmlns:wp="http://schemas.openxmlformats.org/drawingml/2006/wordprocessingDrawing" xmlns:w10="urn:schemas-microsoft-com:office:word" xmlns:w="http://schemas.openxmlformats.org/wordprocessingml/2006/main" xmlns:w14="http://schemas.microsoft.com/office/word/2010/wordml" xmlns:w15="http://schemas.microsoft.com/office/word/2012/wordml" xmlns:wpg="http://schemas.microsoft.com/office/word/2010/wordprocessingGroup" xmlns:wpi="http://schemas.microsoft.com/office/word/2010/wordprocessingInk" xmlns:wne="http://schemas.microsoft.com/office/word/2006/wordml" xmlns:wps="http://schemas.microsoft.com/office/word/2010/wordprocessingShape" xmlns:cx="http://schemas.microsoft.com/office/drawing/2014/chartex" xmlns:cx1="http://schemas.microsoft.com/office/drawing/2015/9/8/chartex" xmlns:cx2="http://schemas.microsoft.com/office/drawing/2015/10/21/chartex" xmlns:cx3="http://schemas.microsoft.com/office/drawing/2016/5/9/chartex" xmlns:cx4="http://schemas.microsoft.com/office/drawing/2016/5/10/chartex" xmlns:cx5="http://schemas.microsoft.com/office/drawing/2016/5/11/chartex" xmlns:cx6="http://schemas.microsoft.com/office/drawing/2016/5/12/chartex" xmlns:cx7="http://schemas.microsoft.com/office/drawing/2016/5/13/chartex" xmlns:cx8="http://schemas.microsoft.com/office/drawing/2016/5/14/chartex" xmlns:w16cid="http://schemas.microsoft.com/office/word/2016/wordml/cid" xmlns:w16se="http://schemas.microsoft.com/office/word/2015/wordml/symex">
-  <w:p>
-    <w:pPr>
-      <w:pBdr>
-        <w:bottom w:val="single" w:color="1F3A5F" w:sz="6" w:space="4"/>
-      </w:pBdr>
-      <w:bidi/>
-    </w:pPr>
-    <w:r>
-      <w:rPr>
-        <w:rFonts w:ascii="Arial" w:cs="Arial" w:eastAsia="Arial" w:hAnsi="Arial"/>
-        <w:color w:val="666666"/>
-        <w:sz w:val="17"/>
-        <w:szCs w:val="17"/>
-        <w:rtl/>
-      </w:rPr>
-      <w:t xml:space="preserve">סולל בונה · תכנית הכשרה לעובדים חדשים · נוהל QA-06</w:t>
-    </w:r>
-  </w:p>
+  <w:tbl>
+    <w:tblPr>
+      <w:bidiVisual/>
+      <w:tblW w:type="dxa" w:w="9638"/>
+      <w:tblBorders>
+        <w:top w:val="single" w:color="auto" w:sz="4"/>
+        <w:left w:val="single" w:color="auto" w:sz="4"/>
+        <w:bottom w:val="single" w:color="auto" w:sz="4"/>
+        <w:right w:val="single" w:color="auto" w:sz="4"/>
+        <w:insideH w:val="single" w:color="auto" w:sz="4"/>
+        <w:insideV w:val="single" w:color="auto" w:sz="4"/>
+      </w:tblBorders>
+    </w:tblPr>
+    <w:tblGrid>
+      <w:gridCol w:w="7238"/>
+      <w:gridCol w:w="2400"/>
+    </w:tblGrid>
+    <w:tr>
+      <w:tc>
+        <w:tcPr>
+          <w:tcW w:type="dxa" w:w="7238"/>
+          <w:tcBorders>
+            <w:top w:val="none" w:color="FFFFFF" w:sz="0"/>
+            <w:left w:val="none" w:color="FFFFFF" w:sz="0"/>
+            <w:bottom w:val="single" w:color="1F3A5F" w:sz="6"/>
+            <w:right w:val="none" w:color="FFFFFF" w:sz="0"/>
+          </w:tcBorders>
+          <w:vAlign w:val="bottom"/>
+        </w:tcPr>
+        <w:p>
+          <w:pPr>
+            <w:bidi/>
+            <w:spacing w:after="60"/>
+          </w:pPr>
+          <w:r>
+            <w:rPr>
+              <w:rFonts w:ascii="Arial" w:cs="Arial" w:eastAsia="Arial" w:hAnsi="Arial"/>
+              <w:color w:val="666666"/>
+              <w:sz w:val="17"/>
+              <w:szCs w:val="17"/>
+              <w:rtl/>
+            </w:rPr>
+            <w:t xml:space="preserve">שיכון ובינוי סולל בונה · תכנית הכשרה לעובדים חדשים · נוהל QA-06</w:t>
+          </w:r>
+        </w:p>
+      </w:tc>
+      <w:tc>
+        <w:tcPr>
+          <w:tcW w:type="dxa" w:w="2400"/>
+          <w:tcBorders>
+            <w:top w:val="none" w:color="FFFFFF" w:sz="0"/>
+            <w:left w:val="none" w:color="FFFFFF" w:sz="0"/>
+            <w:bottom w:val="single" w:color="1F3A5F" w:sz="6"/>
+            <w:right w:val="none" w:color="FFFFFF" w:sz="0"/>
+          </w:tcBorders>
+          <w:vAlign w:val="bottom"/>
+        </w:tcPr>
+        <w:p>
+          <w:pPr>
+            <w:bidi/>
+            <w:spacing w:after="60"/>
+            <w:jc w:val="left"/>
+          </w:pPr>
+          <w:r>
+            <w:drawing>
+              <wp:inline distT="0" distB="0" distL="0" distR="0">
+                <wp:extent cx="714375" cy="247650"/>
+                <wp:effectExtent t="0" r="0" b="0" l="0"/>
+                <wp:docPr id="1" name="" descr="" title=""/>
+                <wp:cNvGraphicFramePr>
+                  <a:graphicFrameLocks xmlns:a="http://schemas.openxmlformats.org/drawingml/2006/main" noChangeAspect="1"/>
+                </wp:cNvGraphicFramePr>
+                <a:graphic xmlns:a="http://schemas.openxmlformats.org/drawingml/2006/main">
+                  <a:graphicData uri="http://schemas.openxmlformats.org/drawingml/2006/picture">
+                    <pic:pic xmlns:pic="http://schemas.openxmlformats.org/drawingml/2006/picture">
+                      <pic:nvPicPr>
+                        <pic:cNvPr id="0" name="" descr=""/>
+                        <pic:cNvPicPr>
+                          <a:picLocks noChangeAspect="1" noChangeArrowheads="1"/>
+                        </pic:cNvPicPr>
+                      </pic:nvPicPr>
+                      <pic:blipFill>
+                        <a:blip r:embed="rId0" cstate="none"/>
+                        <a:srcRect/>
+                        <a:stretch>
+                          <a:fillRect/>
+                        </a:stretch>
+                      </pic:blipFill>
+                      <pic:spPr bwMode="auto">
+                        <a:xfrm>
+                          <a:off x="0" y="0"/>
+                          <a:ext cx="714375" cy="247650"/>
+                        </a:xfrm>
+                        <a:prstGeom prst="rect">
+                          <a:avLst/>
+                        </a:prstGeom>
+                      </pic:spPr>
+                    </pic:pic>
+                  </a:graphicData>
+                </a:graphic>
+              </wp:inline>
+            </w:drawing>
+          </w:r>
+        </w:p>
+      </w:tc>
+    </w:tr>
+  </w:tbl>
 </w:hdr>
 </file>
 
 <file path=word/header8.xml><?xml version="1.0" encoding="utf-8"?>
 <w:hdr xmlns:wpc="http://schemas.microsoft.com/office/word/2010/wordprocessingCanvas" xmlns:mc="http://schemas.openxmlformats.org/markup-compatibility/2006" xmlns:o="urn:schemas-microsoft-com:office:office" xmlns:r="http://schemas.openxmlformats.org/officeDocument/2006/relationships" xmlns:m="http://schemas.openxmlformats.org/officeDocument/2006/math" xmlns:v="urn:schemas-microsoft-com:vml" xmlns:wp14="http://schemas.microsoft.com/office/word/2010/wordprocessingDrawing" xmlns:wp="http://schemas.openxmlformats.org/drawingml/2006/wordprocessingDrawing" xmlns:w10="urn:schemas-microsoft-com:office:word" xmlns:w="http://schemas.openxmlformats.org/wordprocessingml/2006/main" xmlns:w14="http://schemas.microsoft.com/office/word/2010/wordml" xmlns:w15="http://schemas.microsoft.com/office/word/2012/wordml" xmlns:wpg="http://schemas.microsoft.com/office/word/2010/wordprocessingGroup" xmlns:wpi="http://schemas.microsoft.com/office/word/2010/wordprocessingInk" xmlns:wne="http://schemas.microsoft.com/office/word/2006/wordml" xmlns:wps="http://schemas.microsoft.com/office/word/2010/wordprocessingShape" xmlns:cx="http://schemas.microsoft.com/office/drawing/2014/chartex" xmlns:cx1="http://schemas.microsoft.com/office/drawing/2015/9/8/chartex" xmlns:cx2="http://schemas.microsoft.com/office/drawing/2015/10/21/chartex" xmlns:cx3="http://schemas.microsoft.com/office/drawing/2016/5/9/chartex" xmlns:cx4="http://schemas.microsoft.com/office/drawing/2016/5/10/chartex" xmlns:cx5="http://schemas.microsoft.com/office/drawing/2016/5/11/chartex" xmlns:cx6="http://schemas.microsoft.com/office/drawing/2016/5/12/chartex" xmlns:cx7="http://schemas.microsoft.com/office/drawing/2016/5/13/chartex" xmlns:cx8="http://schemas.microsoft.com/office/drawing/2016/5/14/chartex" xmlns:w16cid="http://schemas.microsoft.com/office/word/2016/wordml/cid" xmlns:w16se="http://schemas.microsoft.com/office/word/2015/wordml/symex">
-  <w:p>
-    <w:pPr>
-      <w:pBdr>
-        <w:bottom w:val="single" w:color="1F3A5F" w:sz="6" w:space="4"/>
-      </w:pBdr>
-      <w:bidi/>
-    </w:pPr>
-    <w:r>
-      <w:rPr>
-        <w:rFonts w:ascii="Arial" w:cs="Arial" w:eastAsia="Arial" w:hAnsi="Arial"/>
-        <w:color w:val="666666"/>
-        <w:sz w:val="17"/>
-        <w:szCs w:val="17"/>
-        <w:rtl/>
-      </w:rPr>
-      <w:t xml:space="preserve">סולל בונה · תכנית הכשרה לעובדים חדשים · נוהל QA-07</w:t>
-    </w:r>
-  </w:p>
+  <w:tbl>
+    <w:tblPr>
+      <w:bidiVisual/>
+      <w:tblW w:type="dxa" w:w="9638"/>
+      <w:tblBorders>
+        <w:top w:val="single" w:color="auto" w:sz="4"/>
+        <w:left w:val="single" w:color="auto" w:sz="4"/>
+        <w:bottom w:val="single" w:color="auto" w:sz="4"/>
+        <w:right w:val="single" w:color="auto" w:sz="4"/>
+        <w:insideH w:val="single" w:color="auto" w:sz="4"/>
+        <w:insideV w:val="single" w:color="auto" w:sz="4"/>
+      </w:tblBorders>
+    </w:tblPr>
+    <w:tblGrid>
+      <w:gridCol w:w="7238"/>
+      <w:gridCol w:w="2400"/>
+    </w:tblGrid>
+    <w:tr>
+      <w:tc>
+        <w:tcPr>
+          <w:tcW w:type="dxa" w:w="7238"/>
+          <w:tcBorders>
+            <w:top w:val="none" w:color="FFFFFF" w:sz="0"/>
+            <w:left w:val="none" w:color="FFFFFF" w:sz="0"/>
+            <w:bottom w:val="single" w:color="1F3A5F" w:sz="6"/>
+            <w:right w:val="none" w:color="FFFFFF" w:sz="0"/>
+          </w:tcBorders>
+          <w:vAlign w:val="bottom"/>
+        </w:tcPr>
+        <w:p>
+          <w:pPr>
+            <w:bidi/>
+            <w:spacing w:after="60"/>
+          </w:pPr>
+          <w:r>
+            <w:rPr>
+              <w:rFonts w:ascii="Arial" w:cs="Arial" w:eastAsia="Arial" w:hAnsi="Arial"/>
+              <w:color w:val="666666"/>
+              <w:sz w:val="17"/>
+              <w:szCs w:val="17"/>
+              <w:rtl/>
+            </w:rPr>
+            <w:t xml:space="preserve">שיכון ובינוי סולל בונה · תכנית הכשרה לעובדים חדשים · נוהל QA-07</w:t>
+          </w:r>
+        </w:p>
+      </w:tc>
+      <w:tc>
+        <w:tcPr>
+          <w:tcW w:type="dxa" w:w="2400"/>
+          <w:tcBorders>
+            <w:top w:val="none" w:color="FFFFFF" w:sz="0"/>
+            <w:left w:val="none" w:color="FFFFFF" w:sz="0"/>
+            <w:bottom w:val="single" w:color="1F3A5F" w:sz="6"/>
+            <w:right w:val="none" w:color="FFFFFF" w:sz="0"/>
+          </w:tcBorders>
+          <w:vAlign w:val="bottom"/>
+        </w:tcPr>
+        <w:p>
+          <w:pPr>
+            <w:bidi/>
+            <w:spacing w:after="60"/>
+            <w:jc w:val="left"/>
+          </w:pPr>
+          <w:r>
+            <w:drawing>
+              <wp:inline distT="0" distB="0" distL="0" distR="0">
+                <wp:extent cx="714375" cy="247650"/>
+                <wp:effectExtent t="0" r="0" b="0" l="0"/>
+                <wp:docPr id="1" name="" descr="" title=""/>
+                <wp:cNvGraphicFramePr>
+                  <a:graphicFrameLocks xmlns:a="http://schemas.openxmlformats.org/drawingml/2006/main" noChangeAspect="1"/>
+                </wp:cNvGraphicFramePr>
+                <a:graphic xmlns:a="http://schemas.openxmlformats.org/drawingml/2006/main">
+                  <a:graphicData uri="http://schemas.openxmlformats.org/drawingml/2006/picture">
+                    <pic:pic xmlns:pic="http://schemas.openxmlformats.org/drawingml/2006/picture">
+                      <pic:nvPicPr>
+                        <pic:cNvPr id="0" name="" descr=""/>
+                        <pic:cNvPicPr>
+                          <a:picLocks noChangeAspect="1" noChangeArrowheads="1"/>
+                        </pic:cNvPicPr>
+                      </pic:nvPicPr>
+                      <pic:blipFill>
+                        <a:blip r:embed="rId0" cstate="none"/>
+                        <a:srcRect/>
+                        <a:stretch>
+                          <a:fillRect/>
+                        </a:stretch>
+                      </pic:blipFill>
+                      <pic:spPr bwMode="auto">
+                        <a:xfrm>
+                          <a:off x="0" y="0"/>
+                          <a:ext cx="714375" cy="247650"/>
+                        </a:xfrm>
+                        <a:prstGeom prst="rect">
+                          <a:avLst/>
+                        </a:prstGeom>
+                      </pic:spPr>
+                    </pic:pic>
+                  </a:graphicData>
+                </a:graphic>
+              </wp:inline>
+            </w:drawing>
+          </w:r>
+        </w:p>
+      </w:tc>
+    </w:tr>
+  </w:tbl>
 </w:hdr>
 </file>
 
 <file path=word/header9.xml><?xml version="1.0" encoding="utf-8"?>
 <w:hdr xmlns:wpc="http://schemas.microsoft.com/office/word/2010/wordprocessingCanvas" xmlns:mc="http://schemas.openxmlformats.org/markup-compatibility/2006" xmlns:o="urn:schemas-microsoft-com:office:office" xmlns:r="http://schemas.openxmlformats.org/officeDocument/2006/relationships" xmlns:m="http://schemas.openxmlformats.org/officeDocument/2006/math" xmlns:v="urn:schemas-microsoft-com:vml" xmlns:wp14="http://schemas.microsoft.com/office/word/2010/wordprocessingDrawing" xmlns:wp="http://schemas.openxmlformats.org/drawingml/2006/wordprocessingDrawing" xmlns:w10="urn:schemas-microsoft-com:office:word" xmlns:w="http://schemas.openxmlformats.org/wordprocessingml/2006/main" xmlns:w14="http://schemas.microsoft.com/office/word/2010/wordml" xmlns:w15="http://schemas.microsoft.com/office/word/2012/wordml" xmlns:wpg="http://schemas.microsoft.com/office/word/2010/wordprocessingGroup" xmlns:wpi="http://schemas.microsoft.com/office/word/2010/wordprocessingInk" xmlns:wne="http://schemas.microsoft.com/office/word/2006/wordml" xmlns:wps="http://schemas.microsoft.com/office/word/2010/wordprocessingShape" xmlns:cx="http://schemas.microsoft.com/office/drawing/2014/chartex" xmlns:cx1="http://schemas.microsoft.com/office/drawing/2015/9/8/chartex" xmlns:cx2="http://schemas.microsoft.com/office/drawing/2015/10/21/chartex" xmlns:cx3="http://schemas.microsoft.com/office/drawing/2016/5/9/chartex" xmlns:cx4="http://schemas.microsoft.com/office/drawing/2016/5/10/chartex" xmlns:cx5="http://schemas.microsoft.com/office/drawing/2016/5/11/chartex" xmlns:cx6="http://schemas.microsoft.com/office/drawing/2016/5/12/chartex" xmlns:cx7="http://schemas.microsoft.com/office/drawing/2016/5/13/chartex" xmlns:cx8="http://schemas.microsoft.com/office/drawing/2016/5/14/chartex" xmlns:w16cid="http://schemas.microsoft.com/office/word/2016/wordml/cid" xmlns:w16se="http://schemas.microsoft.com/office/word/2015/wordml/symex">
-  <w:p>
-    <w:pPr>
-      <w:pBdr>
-        <w:bottom w:val="single" w:color="1F3A5F" w:sz="6" w:space="4"/>
-      </w:pBdr>
-      <w:bidi/>
-    </w:pPr>
-    <w:r>
-      <w:rPr>
-        <w:rFonts w:ascii="Arial" w:cs="Arial" w:eastAsia="Arial" w:hAnsi="Arial"/>
-        <w:color w:val="666666"/>
-        <w:sz w:val="17"/>
-        <w:szCs w:val="17"/>
-        <w:rtl/>
-      </w:rPr>
-      <w:t xml:space="preserve">סולל בונה · תכנית הכשרה לעובדים חדשים · נוהל QA-08</w:t>
-    </w:r>
-  </w:p>
+  <w:tbl>
+    <w:tblPr>
+      <w:bidiVisual/>
+      <w:tblW w:type="dxa" w:w="9638"/>
+      <w:tblBorders>
+        <w:top w:val="single" w:color="auto" w:sz="4"/>
+        <w:left w:val="single" w:color="auto" w:sz="4"/>
+        <w:bottom w:val="single" w:color="auto" w:sz="4"/>
+        <w:right w:val="single" w:color="auto" w:sz="4"/>
+        <w:insideH w:val="single" w:color="auto" w:sz="4"/>
+        <w:insideV w:val="single" w:color="auto" w:sz="4"/>
+      </w:tblBorders>
+    </w:tblPr>
+    <w:tblGrid>
+      <w:gridCol w:w="7238"/>
+      <w:gridCol w:w="2400"/>
+    </w:tblGrid>
+    <w:tr>
+      <w:tc>
+        <w:tcPr>
+          <w:tcW w:type="dxa" w:w="7238"/>
+          <w:tcBorders>
+            <w:top w:val="none" w:color="FFFFFF" w:sz="0"/>
+            <w:left w:val="none" w:color="FFFFFF" w:sz="0"/>
+            <w:bottom w:val="single" w:color="1F3A5F" w:sz="6"/>
+            <w:right w:val="none" w:color="FFFFFF" w:sz="0"/>
+          </w:tcBorders>
+          <w:vAlign w:val="bottom"/>
+        </w:tcPr>
+        <w:p>
+          <w:pPr>
+            <w:bidi/>
+            <w:spacing w:after="60"/>
+          </w:pPr>
+          <w:r>
+            <w:rPr>
+              <w:rFonts w:ascii="Arial" w:cs="Arial" w:eastAsia="Arial" w:hAnsi="Arial"/>
+              <w:color w:val="666666"/>
+              <w:sz w:val="17"/>
+              <w:szCs w:val="17"/>
+              <w:rtl/>
+            </w:rPr>
+            <w:t xml:space="preserve">שיכון ובינוי סולל בונה · תכנית הכשרה לעובדים חדשים · נוהל QA-08</w:t>
+          </w:r>
+        </w:p>
+      </w:tc>
+      <w:tc>
+        <w:tcPr>
+          <w:tcW w:type="dxa" w:w="2400"/>
+          <w:tcBorders>
+            <w:top w:val="none" w:color="FFFFFF" w:sz="0"/>
+            <w:left w:val="none" w:color="FFFFFF" w:sz="0"/>
+            <w:bottom w:val="single" w:color="1F3A5F" w:sz="6"/>
+            <w:right w:val="none" w:color="FFFFFF" w:sz="0"/>
+          </w:tcBorders>
+          <w:vAlign w:val="bottom"/>
+        </w:tcPr>
+        <w:p>
+          <w:pPr>
+            <w:bidi/>
+            <w:spacing w:after="60"/>
+            <w:jc w:val="left"/>
+          </w:pPr>
+          <w:r>
+            <w:drawing>
+              <wp:inline distT="0" distB="0" distL="0" distR="0">
+                <wp:extent cx="714375" cy="247650"/>
+                <wp:effectExtent t="0" r="0" b="0" l="0"/>
+                <wp:docPr id="1" name="" descr="" title=""/>
+                <wp:cNvGraphicFramePr>
+                  <a:graphicFrameLocks xmlns:a="http://schemas.openxmlformats.org/drawingml/2006/main" noChangeAspect="1"/>
+                </wp:cNvGraphicFramePr>
+                <a:graphic xmlns:a="http://schemas.openxmlformats.org/drawingml/2006/main">
+                  <a:graphicData uri="http://schemas.openxmlformats.org/drawingml/2006/picture">
+                    <pic:pic xmlns:pic="http://schemas.openxmlformats.org/drawingml/2006/picture">
+                      <pic:nvPicPr>
+                        <pic:cNvPr id="0" name="" descr=""/>
+                        <pic:cNvPicPr>
+                          <a:picLocks noChangeAspect="1" noChangeArrowheads="1"/>
+                        </pic:cNvPicPr>
+                      </pic:nvPicPr>
+                      <pic:blipFill>
+                        <a:blip r:embed="rId0" cstate="none"/>
+                        <a:srcRect/>
+                        <a:stretch>
+                          <a:fillRect/>
+                        </a:stretch>
+                      </pic:blipFill>
+                      <pic:spPr bwMode="auto">
+                        <a:xfrm>
+                          <a:off x="0" y="0"/>
+                          <a:ext cx="714375" cy="247650"/>
+                        </a:xfrm>
+                        <a:prstGeom prst="rect">
+                          <a:avLst/>
+                        </a:prstGeom>
+                      </pic:spPr>
+                    </pic:pic>
+                  </a:graphicData>
+                </a:graphic>
+              </wp:inline>
+            </w:drawing>
+          </w:r>
+        </w:p>
+      </w:tc>
+    </w:tr>
+  </w:tbl>
 </w:hdr>
 </file>
 

</xml_diff>